<commit_message>
Add Martabe WIs batch 4 to SWI 204-010, 205-012, 205-017
Co-Authored-By: Claude Sonnet 5.5 <noreply@anthropic.com>
Claude-Session: https://claude.ai/code/session_0121qocWgsZdFAsne2oz9sHT
</commit_message>
<xml_diff>
--- a/SWI/204-Physical-Testwork/MM-4034-033-OR-03-SWI-PRO-MET-204-010-Flocculant-Screening-and-Dose-Optimisation-Test-RevA.docx
+++ b/SWI/204-Physical-Testwork/MM-4034-033-OR-03-SWI-PRO-MET-204-010-Flocculant-Screening-and-Dose-Optimisation-Test-RevA.docx
@@ -602,6 +602,60 @@
       <w:pPr>
         <w:spacing w:after="100" w:before="0" w:line="245"/>
       </w:pPr>
+    </w:p>
+    <w:tbl>
+      <w:tblPr>
+        <w:tblW w:type="dxa" w:w="9026"/>
+        <w:tblBorders>
+          <w:left w:val="single" w:color="B7791F" w:sz="18"/>
+        </w:tblBorders>
+        <w:tblCellMar>
+          <w:top w:type="dxa" w:w="90"/>
+          <w:left w:type="dxa" w:w="150"/>
+          <w:bottom w:type="dxa" w:w="90"/>
+          <w:right w:type="dxa" w:w="120"/>
+        </w:tblCellMar>
+      </w:tblPr>
+      <w:tblGrid>
+        <w:gridCol w:w="9026"/>
+      </w:tblGrid>
+      <w:tr>
+        <w:tc>
+          <w:tcPr>
+            <w:tcW w:type="dxa" w:w="9026"/>
+            <w:shd w:val="clear" w:color="auto" w:fill="FFF4D6"/>
+          </w:tcPr>
+          <w:p>
+            <w:pPr>
+              <w:spacing w:after="0" w:before="0" w:line="245"/>
+            </w:pPr>
+            <w:r>
+              <w:rPr>
+                <w:rFonts w:ascii="Calibri" w:cs="Calibri" w:eastAsia="Calibri" w:hAnsi="Calibri"/>
+                <w:b/>
+                <w:bCs/>
+                <w:color w:val="7A4B00"/>
+                <w:sz w:val="17"/>
+                <w:szCs w:val="17"/>
+              </w:rPr>
+              <w:t xml:space="preserve">DRAFT FOR REVIEW. Martabe work instruction 'Settling Test with Variance %Strength Flocc' (22/03/2025) added as Section 6 Part B. Not approved until reviewed. JSEA JSEA-PRO-MET-204-010 must be checked against the added steps.</w:t>
+            </w:r>
+          </w:p>
+        </w:tc>
+      </w:tr>
+    </w:tbl>
+    <w:p>
+      <w:pPr>
+        <w:spacing w:after="60" w:before="0" w:line="245"/>
+      </w:pPr>
+      <w:r>
+        <w:rPr>
+          <w:rFonts w:ascii="Calibri" w:cs="Calibri" w:eastAsia="Calibri" w:hAnsi="Calibri"/>
+          <w:sz w:val="17"/>
+          <w:szCs w:val="17"/>
+        </w:rPr>
+        <w:t xml:space="preserve"/>
+      </w:r>
     </w:p>
     <w:p>
       <w:pPr>
@@ -1729,6 +1783,42 @@
     </w:p>
     <w:p>
       <w:pPr>
+        <w:pStyle w:val="ListParagraph"/>
+        <w:numPr>
+          <w:ilvl w:val="0"/>
+          <w:numId w:val="1"/>
+        </w:numPr>
+        <w:spacing w:after="60" w:line="245"/>
+      </w:pPr>
+      <w:r>
+        <w:rPr>
+          <w:rFonts w:ascii="Calibri" w:cs="Calibri" w:eastAsia="Calibri" w:hAnsi="Calibri"/>
+          <w:sz w:val="17"/>
+          <w:szCs w:val="17"/>
+        </w:rPr>
+        <w:t xml:space="preserve">[M] Balance, 1 L graduated cylinders (4 per test set), syringe, beakers, 250 mL sample bottles, vertical stirrer, filter press, drying oven</w:t>
+      </w:r>
+    </w:p>
+    <w:p>
+      <w:pPr>
+        <w:pStyle w:val="ListParagraph"/>
+        <w:numPr>
+          <w:ilvl w:val="0"/>
+          <w:numId w:val="1"/>
+        </w:numPr>
+        <w:spacing w:after="60" w:line="245"/>
+      </w:pPr>
+      <w:r>
+        <w:rPr>
+          <w:rFonts w:ascii="Calibri" w:cs="Calibri" w:eastAsia="Calibri" w:hAnsi="Calibri"/>
+          <w:sz w:val="17"/>
+          <w:szCs w:val="17"/>
+        </w:rPr>
+        <w:t xml:space="preserve">[M] Laboratory flocculant, process water, acetone; Martabe slurry characterisation spreadsheet (density to per cent solids)</w:t>
+      </w:r>
+    </w:p>
+    <w:p>
+      <w:pPr>
         <w:pStyle w:val="Heading1"/>
         <w:spacing w:after="120" w:before="260"/>
       </w:pPr>
@@ -1746,6 +1836,23 @@
     </w:p>
     <w:p>
       <w:pPr>
+        <w:spacing w:after="90" w:before="180" w:line="245"/>
+        <w:keepNext/>
+      </w:pPr>
+      <w:r>
+        <w:rPr>
+          <w:rFonts w:ascii="Calibri" w:cs="Calibri" w:eastAsia="Calibri" w:hAnsi="Calibri"/>
+          <w:b/>
+          <w:bCs/>
+          <w:color w:val="1F3864"/>
+          <w:sz w:val="19"/>
+          <w:szCs w:val="19"/>
+        </w:rPr>
+        <w:t xml:space="preserve">Part A - Flocculant type and dose comparison</w:t>
+      </w:r>
+    </w:p>
+    <w:p>
+      <w:pPr>
         <w:ind w:left="280"/>
         <w:spacing w:after="50" w:before="0" w:line="245"/>
       </w:pPr>
@@ -1910,6 +2017,337 @@
           <w:szCs w:val="17"/>
         </w:rPr>
         <w:t xml:space="preserve">  Report against the plant flocculant basis in the Roytec control philosophies.</w:t>
+      </w:r>
+    </w:p>
+    <w:p>
+      <w:pPr>
+        <w:spacing w:after="90" w:before="180" w:line="245"/>
+        <w:keepNext/>
+      </w:pPr>
+      <w:r>
+        <w:rPr>
+          <w:rFonts w:ascii="Calibri" w:cs="Calibri" w:eastAsia="Calibri" w:hAnsi="Calibri"/>
+          <w:b/>
+          <w:bCs/>
+          <w:color w:val="1F3864"/>
+          <w:sz w:val="19"/>
+          <w:szCs w:val="19"/>
+        </w:rPr>
+        <w:t xml:space="preserve">Part B - Settling test with flocculant solution strength variance [M]</w:t>
+      </w:r>
+    </w:p>
+    <w:p>
+      <w:pPr>
+        <w:spacing w:after="60" w:before="0" w:line="245"/>
+      </w:pPr>
+      <w:r>
+        <w:rPr>
+          <w:rFonts w:ascii="Calibri" w:cs="Calibri" w:eastAsia="Calibri" w:hAnsi="Calibri"/>
+          <w:sz w:val="17"/>
+          <w:szCs w:val="17"/>
+        </w:rPr>
+        <w:t xml:space="preserve">[M] = taken from the Martabe team work instruction "Settling Test with Variance %Strength Flocc" (22/03/2025). [CONFIRM] = unspecified or inconsistent in the source; resolve before this instruction is approved for use. Part A (original steps) is unchanged.</w:t>
+      </w:r>
+    </w:p>
+    <w:p>
+      <w:pPr>
+        <w:spacing w:after="60" w:before="0" w:line="245"/>
+      </w:pPr>
+      <w:r>
+        <w:rPr>
+          <w:rFonts w:ascii="Calibri" w:cs="Calibri" w:eastAsia="Calibri" w:hAnsi="Calibri"/>
+          <w:sz w:val="17"/>
+          <w:szCs w:val="17"/>
+        </w:rPr>
+        <w:t xml:space="preserve">Purpose [M]: find the settling time at each flocculant solution strength. Part A holds the make-up strength constant; Part B varies it at 0.35, 0.40, 0.45 and 0.50 per cent. [CONFIRM] Section 5 lists settling cylinders as NOT PURCHASED; the source uses plain 1 L graduated cylinders - confirm these are acceptable.</w:t>
+      </w:r>
+    </w:p>
+    <w:p>
+      <w:pPr>
+        <w:ind w:left="280"/>
+        <w:spacing w:after="50" w:before="0" w:line="245"/>
+      </w:pPr>
+      <w:r>
+        <w:rPr>
+          <w:rFonts w:ascii="Calibri" w:cs="Calibri" w:eastAsia="Calibri" w:hAnsi="Calibri"/>
+          <w:b/>
+          <w:bCs/>
+          <w:sz w:val="17"/>
+          <w:szCs w:val="17"/>
+        </w:rPr>
+        <w:t xml:space="preserve">1.</w:t>
+      </w:r>
+      <w:r>
+        <w:rPr>
+          <w:rFonts w:ascii="Calibri" w:cs="Calibri" w:eastAsia="Calibri" w:hAnsi="Calibri"/>
+          <w:sz w:val="17"/>
+          <w:szCs w:val="17"/>
+        </w:rPr>
+        <w:t xml:space="preserve">  Make up flocculant solutions at 0.35, 0.40, 0.45 and 0.50 per cent with process water (Martabe SOP for flocculant make-up, not yet received).</w:t>
+      </w:r>
+    </w:p>
+    <w:p>
+      <w:pPr>
+        <w:ind w:left="280"/>
+        <w:spacing w:after="50" w:before="0" w:line="245"/>
+      </w:pPr>
+      <w:r>
+        <w:rPr>
+          <w:rFonts w:ascii="Calibri" w:cs="Calibri" w:eastAsia="Calibri" w:hAnsi="Calibri"/>
+          <w:b/>
+          <w:bCs/>
+          <w:sz w:val="17"/>
+          <w:szCs w:val="17"/>
+        </w:rPr>
+        <w:t xml:space="preserve">2.</w:t>
+      </w:r>
+      <w:r>
+        <w:rPr>
+          <w:rFonts w:ascii="Calibri" w:cs="Calibri" w:eastAsia="Calibri" w:hAnsi="Calibri"/>
+          <w:sz w:val="17"/>
+          <w:szCs w:val="17"/>
+        </w:rPr>
+        <w:t xml:space="preserve">  Stir the tailing sample until even with the vertical stirrer.</w:t>
+      </w:r>
+    </w:p>
+    <w:p>
+      <w:pPr>
+        <w:ind w:left="280"/>
+        <w:spacing w:after="50" w:before="0" w:line="245"/>
+      </w:pPr>
+      <w:r>
+        <w:rPr>
+          <w:rFonts w:ascii="Calibri" w:cs="Calibri" w:eastAsia="Calibri" w:hAnsi="Calibri"/>
+          <w:b/>
+          <w:bCs/>
+          <w:sz w:val="17"/>
+          <w:szCs w:val="17"/>
+        </w:rPr>
+        <w:t xml:space="preserve">3.</w:t>
+      </w:r>
+      <w:r>
+        <w:rPr>
+          <w:rFonts w:ascii="Calibri" w:cs="Calibri" w:eastAsia="Calibri" w:hAnsi="Calibri"/>
+          <w:sz w:val="17"/>
+          <w:szCs w:val="17"/>
+        </w:rPr>
+        <w:t xml:space="preserve">  Put 1 L of tailing slurry in a graduated cylinder and weigh it. Prepare 4 cylinders for one test set.</w:t>
+      </w:r>
+    </w:p>
+    <w:p>
+      <w:pPr>
+        <w:ind w:left="280"/>
+        <w:spacing w:after="50" w:before="0" w:line="245"/>
+      </w:pPr>
+      <w:r>
+        <w:rPr>
+          <w:rFonts w:ascii="Calibri" w:cs="Calibri" w:eastAsia="Calibri" w:hAnsi="Calibri"/>
+          <w:b/>
+          <w:bCs/>
+          <w:sz w:val="17"/>
+          <w:szCs w:val="17"/>
+        </w:rPr>
+        <w:t xml:space="preserve">4.</w:t>
+      </w:r>
+      <w:r>
+        <w:rPr>
+          <w:rFonts w:ascii="Calibri" w:cs="Calibri" w:eastAsia="Calibri" w:hAnsi="Calibri"/>
+          <w:sz w:val="17"/>
+          <w:szCs w:val="17"/>
+        </w:rPr>
+        <w:t xml:space="preserve">  Check the weight difference between cylinders is below 4 g. If it is above 4 g, stir again and repeat the previous step.</w:t>
+      </w:r>
+    </w:p>
+    <w:p>
+      <w:pPr>
+        <w:ind w:left="280"/>
+        <w:spacing w:after="50" w:before="0" w:line="245"/>
+      </w:pPr>
+      <w:r>
+        <w:rPr>
+          <w:rFonts w:ascii="Calibri" w:cs="Calibri" w:eastAsia="Calibri" w:hAnsi="Calibri"/>
+          <w:b/>
+          <w:bCs/>
+          <w:sz w:val="17"/>
+          <w:szCs w:val="17"/>
+        </w:rPr>
+        <w:t xml:space="preserve">5.</w:t>
+      </w:r>
+      <w:r>
+        <w:rPr>
+          <w:rFonts w:ascii="Calibri" w:cs="Calibri" w:eastAsia="Calibri" w:hAnsi="Calibri"/>
+          <w:sz w:val="17"/>
+          <w:szCs w:val="17"/>
+        </w:rPr>
+        <w:t xml:space="preserve">  Open the slurry characterisation spreadsheet. Enter ore density 2.6 t/m3. Enter the 1 L slurry weight as pulp density (RHOP): 1.5 kg per litre is entered as 1.5 (1.5 kg/L = 1.5 t/m3). Read off solids mass and per cent solids.</w:t>
+      </w:r>
+    </w:p>
+    <w:p>
+      <w:pPr>
+        <w:ind w:left="280"/>
+        <w:spacing w:after="50" w:before="0" w:line="245"/>
+      </w:pPr>
+      <w:r>
+        <w:rPr>
+          <w:rFonts w:ascii="Calibri" w:cs="Calibri" w:eastAsia="Calibri" w:hAnsi="Calibri"/>
+          <w:b/>
+          <w:bCs/>
+          <w:sz w:val="17"/>
+          <w:szCs w:val="17"/>
+        </w:rPr>
+        <w:t xml:space="preserve">6.</w:t>
+      </w:r>
+      <w:r>
+        <w:rPr>
+          <w:rFonts w:ascii="Calibri" w:cs="Calibri" w:eastAsia="Calibri" w:hAnsi="Calibri"/>
+          <w:sz w:val="17"/>
+          <w:szCs w:val="17"/>
+        </w:rPr>
+        <w:t xml:space="preserve">  Record the solution strength and the dose.</w:t>
+      </w:r>
+    </w:p>
+    <w:p>
+      <w:pPr>
+        <w:ind w:left="280"/>
+        <w:spacing w:after="50" w:before="0" w:line="245"/>
+      </w:pPr>
+      <w:r>
+        <w:rPr>
+          <w:rFonts w:ascii="Calibri" w:cs="Calibri" w:eastAsia="Calibri" w:hAnsi="Calibri"/>
+          <w:b/>
+          <w:bCs/>
+          <w:sz w:val="17"/>
+          <w:szCs w:val="17"/>
+        </w:rPr>
+        <w:t xml:space="preserve">7.</w:t>
+      </w:r>
+      <w:r>
+        <w:rPr>
+          <w:rFonts w:ascii="Calibri" w:cs="Calibri" w:eastAsia="Calibri" w:hAnsi="Calibri"/>
+          <w:sz w:val="17"/>
+          <w:szCs w:val="17"/>
+        </w:rPr>
+        <w:t xml:space="preserve">  Flocculant volume to add (mL) = 100 x solids mass (g) / 1,000,000 x 100 / 0.5. [CONFIRM] the source writes 100 and 0.5 as fixed numbers; read as dose in g/t (100) and solution strength in per cent (0.5), and replace them with the actual dose and strength for each cylinder.</w:t>
+      </w:r>
+    </w:p>
+    <w:p>
+      <w:pPr>
+        <w:ind w:left="280"/>
+        <w:spacing w:after="50" w:before="0" w:line="245"/>
+      </w:pPr>
+      <w:r>
+        <w:rPr>
+          <w:rFonts w:ascii="Calibri" w:cs="Calibri" w:eastAsia="Calibri" w:hAnsi="Calibri"/>
+          <w:b/>
+          <w:bCs/>
+          <w:sz w:val="17"/>
+          <w:szCs w:val="17"/>
+        </w:rPr>
+        <w:t xml:space="preserve">8.</w:t>
+      </w:r>
+      <w:r>
+        <w:rPr>
+          <w:rFonts w:ascii="Calibri" w:cs="Calibri" w:eastAsia="Calibri" w:hAnsi="Calibri"/>
+          <w:sz w:val="17"/>
+          <w:szCs w:val="17"/>
+        </w:rPr>
+        <w:t xml:space="preserve">  Add flocculant at doses of 70, 80, 90 and 100 g/t. [CONFIRM] how the 4 strengths and 4 doses are laid out across the 4 cylinders of a set is not stated.</w:t>
+      </w:r>
+    </w:p>
+    <w:p>
+      <w:pPr>
+        <w:ind w:left="280"/>
+        <w:spacing w:after="50" w:before="0" w:line="245"/>
+      </w:pPr>
+      <w:r>
+        <w:rPr>
+          <w:rFonts w:ascii="Calibri" w:cs="Calibri" w:eastAsia="Calibri" w:hAnsi="Calibri"/>
+          <w:b/>
+          <w:bCs/>
+          <w:sz w:val="17"/>
+          <w:szCs w:val="17"/>
+        </w:rPr>
+        <w:t xml:space="preserve">9.</w:t>
+      </w:r>
+      <w:r>
+        <w:rPr>
+          <w:rFonts w:ascii="Calibri" w:cs="Calibri" w:eastAsia="Calibri" w:hAnsi="Calibri"/>
+          <w:sz w:val="17"/>
+          <w:szCs w:val="17"/>
+        </w:rPr>
+        <w:t xml:space="preserve">  Mix the sample with the stirring rod 8 times.</w:t>
+      </w:r>
+    </w:p>
+    <w:p>
+      <w:pPr>
+        <w:ind w:left="280"/>
+        <w:spacing w:after="50" w:before="0" w:line="245"/>
+      </w:pPr>
+      <w:r>
+        <w:rPr>
+          <w:rFonts w:ascii="Calibri" w:cs="Calibri" w:eastAsia="Calibri" w:hAnsi="Calibri"/>
+          <w:b/>
+          <w:bCs/>
+          <w:sz w:val="17"/>
+          <w:szCs w:val="17"/>
+        </w:rPr>
+        <w:t xml:space="preserve">10.</w:t>
+      </w:r>
+      <w:r>
+        <w:rPr>
+          <w:rFonts w:ascii="Calibri" w:cs="Calibri" w:eastAsia="Calibri" w:hAnsi="Calibri"/>
+          <w:sz w:val="17"/>
+          <w:szCs w:val="17"/>
+        </w:rPr>
+        <w:t xml:space="preserve">  Record the solids level at minute 5, 10, 15, 30, 60 and at 24 hours and 48 hours. [CONFIRM] source reads '60, 24 jam, 48 jam'; minute 60 is assumed.</w:t>
+      </w:r>
+    </w:p>
+    <w:p>
+      <w:pPr>
+        <w:ind w:left="280"/>
+        <w:spacing w:after="50" w:before="0" w:line="245"/>
+      </w:pPr>
+      <w:r>
+        <w:rPr>
+          <w:rFonts w:ascii="Calibri" w:cs="Calibri" w:eastAsia="Calibri" w:hAnsi="Calibri"/>
+          <w:b/>
+          <w:bCs/>
+          <w:sz w:val="17"/>
+          <w:szCs w:val="17"/>
+        </w:rPr>
+        <w:t xml:space="preserve">11.</w:t>
+      </w:r>
+      <w:r>
+        <w:rPr>
+          <w:rFonts w:ascii="Calibri" w:cs="Calibri" w:eastAsia="Calibri" w:hAnsi="Calibri"/>
+          <w:sz w:val="17"/>
+          <w:szCs w:val="17"/>
+        </w:rPr>
+        <w:t xml:space="preserve">  Separate the solids from the water with the filter press.</w:t>
+      </w:r>
+    </w:p>
+    <w:p>
+      <w:pPr>
+        <w:ind w:left="280"/>
+        <w:spacing w:after="50" w:before="0" w:line="245"/>
+      </w:pPr>
+      <w:r>
+        <w:rPr>
+          <w:rFonts w:ascii="Calibri" w:cs="Calibri" w:eastAsia="Calibri" w:hAnsi="Calibri"/>
+          <w:b/>
+          <w:bCs/>
+          <w:sz w:val="17"/>
+          <w:szCs w:val="17"/>
+        </w:rPr>
+        <w:t xml:space="preserve">12.</w:t>
+      </w:r>
+      <w:r>
+        <w:rPr>
+          <w:rFonts w:ascii="Calibri" w:cs="Calibri" w:eastAsia="Calibri" w:hAnsi="Calibri"/>
+          <w:sz w:val="17"/>
+          <w:szCs w:val="17"/>
+        </w:rPr>
+        <w:t xml:space="preserve">  Dry the sample in the oven and weigh it dry to correct the dose to g/t.</w:t>
       </w:r>
     </w:p>
     <w:p>
@@ -2123,6 +2561,24 @@
           <w:szCs w:val="17"/>
         </w:rPr>
         <w:t xml:space="preserve">4034-019-VE-006 Roytec Model 01 and 4034-019B-VE-007 Model 05 flocculant plant control philosophies, received 11 Aug 2026 - the plant make-up concentration and dose basis</w:t>
+      </w:r>
+    </w:p>
+    <w:p>
+      <w:pPr>
+        <w:pStyle w:val="ListParagraph"/>
+        <w:numPr>
+          <w:ilvl w:val="0"/>
+          <w:numId w:val="1"/>
+        </w:numPr>
+        <w:spacing w:after="60" w:line="245"/>
+      </w:pPr>
+      <w:r>
+        <w:rPr>
+          <w:rFonts w:ascii="Calibri" w:cs="Calibri" w:eastAsia="Calibri" w:hAnsi="Calibri"/>
+          <w:sz w:val="17"/>
+          <w:szCs w:val="17"/>
+        </w:rPr>
+        <w:t xml:space="preserve">Martabe work instruction 'Settling Test with Variance %Strength Flocc' (Indonesian, 22/03/2025) - Part B source</w:t>
       </w:r>
     </w:p>
     <w:sectPr>

</xml_diff>

<commit_message>
Add Martabe WIs batch 10 (ETD, DDA pump calibration, titration comparison)
Co-Authored-By: Claude Sonnet 5.5 <noreply@anthropic.com>
Claude-Session: https://claude.ai/code/session_0121qocWgsZdFAsne2oz9sHT
</commit_message>
<xml_diff>
--- a/SWI/204-Physical-Testwork/MM-4034-033-OR-03-SWI-PRO-MET-204-010-Flocculant-Screening-and-Dose-Optimisation-Test-RevA.docx
+++ b/SWI/204-Physical-Testwork/MM-4034-033-OR-03-SWI-PRO-MET-204-010-Flocculant-Screening-and-Dose-Optimisation-Test-RevA.docx
@@ -638,7 +638,7 @@
                 <w:sz w:val="17"/>
                 <w:szCs w:val="17"/>
               </w:rPr>
-              <w:t xml:space="preserve">DRAFT FOR REVIEW. Martabe work instruction 'Settling Test with Variance %Strength Flocc' (22/03/2025) added as Section 6 Part B. Not approved until reviewed. JSEA JSEA-PRO-MET-204-010 must be checked against the added steps.</w:t>
+              <w:t xml:space="preserve">DRAFT FOR REVIEW. Martabe work instructions 'Settling Test with Variance %Strength Flocc' (22/03/2025) as Part B and 'Effective Treatment Dosage' (DOC-3-MET-PMC-WIN-00122-IE, issued 25/12/2024) as Part C added to Section 6. Not approved until reviewed. JSEA JSEA-PRO-MET-204-010 must be checked against the added steps.</w:t>
             </w:r>
           </w:p>
         </w:tc>
@@ -1322,6 +1322,56 @@
           </w:p>
         </w:tc>
       </w:tr>
+      <w:tr>
+        <w:tc>
+          <w:tcPr>
+            <w:tcW w:type="dxa" w:w="2900"/>
+            <w:tcMar>
+              <w:top w:type="dxa" w:w="55"/>
+              <w:left w:type="dxa" w:w="85"/>
+              <w:bottom w:type="dxa" w:w="55"/>
+              <w:right w:type="dxa" w:w="85"/>
+            </w:tcMar>
+          </w:tcPr>
+          <w:p>
+            <w:pPr>
+              <w:spacing w:after="0" w:line="235"/>
+            </w:pPr>
+            <w:r>
+              <w:rPr>
+                <w:rFonts w:ascii="Calibri" w:cs="Calibri" w:eastAsia="Calibri" w:hAnsi="Calibri"/>
+                <w:sz w:val="16"/>
+                <w:szCs w:val="16"/>
+              </w:rPr>
+              <w:t xml:space="preserve">[JSEA to confirm] Solution splash and spill, and a pinch point on the level gauge</w:t>
+            </w:r>
+          </w:p>
+        </w:tc>
+        <w:tc>
+          <w:tcPr>
+            <w:tcW w:type="dxa" w:w="6126"/>
+            <w:tcMar>
+              <w:top w:type="dxa" w:w="55"/>
+              <w:left w:type="dxa" w:w="85"/>
+              <w:bottom w:type="dxa" w:w="55"/>
+              <w:right w:type="dxa" w:w="85"/>
+            </w:tcMar>
+          </w:tcPr>
+          <w:p>
+            <w:pPr>
+              <w:spacing w:after="0" w:line="235"/>
+            </w:pPr>
+            <w:r>
+              <w:rPr>
+                <w:rFonts w:ascii="Calibri" w:cs="Calibri" w:eastAsia="Calibri" w:hAnsi="Calibri"/>
+                <w:sz w:val="16"/>
+                <w:szCs w:val="16"/>
+              </w:rPr>
+              <w:t xml:space="preserve">Latex gloves, glasses and safety boots. Eyewash proven flowing and spill kit at hand; wash splashes under running water; clean spills at once. Keep hands clear of the level gauge pinch point.</w:t>
+            </w:r>
+          </w:p>
+        </w:tc>
+      </w:tr>
     </w:tbl>
     <w:p>
       <w:pPr>
@@ -1819,6 +1869,24 @@
     </w:p>
     <w:p>
       <w:pPr>
+        <w:pStyle w:val="ListParagraph"/>
+        <w:numPr>
+          <w:ilvl w:val="0"/>
+          <w:numId w:val="1"/>
+        </w:numPr>
+        <w:spacing w:after="60" w:line="245"/>
+      </w:pPr>
+      <w:r>
+        <w:rPr>
+          <w:rFonts w:ascii="Calibri" w:cs="Calibri" w:eastAsia="Calibri" w:hAnsi="Calibri"/>
+          <w:sz w:val="17"/>
+          <w:szCs w:val="17"/>
+        </w:rPr>
+        <w:t xml:space="preserve">[M] Beakers, measuring cylinders, level gauge, sieve, turbidity meter with cuvettes, syringe, cone, bucket, iron stirrer</w:t>
+      </w:r>
+    </w:p>
+    <w:p>
+      <w:pPr>
         <w:pStyle w:val="Heading1"/>
         <w:spacing w:after="120" w:before="260"/>
       </w:pPr>
@@ -2075,7 +2143,7 @@
           <w:sz w:val="17"/>
           <w:szCs w:val="17"/>
         </w:rPr>
-        <w:t xml:space="preserve">1.</w:t>
+        <w:t xml:space="preserve">8.</w:t>
       </w:r>
       <w:r>
         <w:rPr>
@@ -2099,7 +2167,7 @@
           <w:sz w:val="17"/>
           <w:szCs w:val="17"/>
         </w:rPr>
-        <w:t xml:space="preserve">2.</w:t>
+        <w:t xml:space="preserve">9.</w:t>
       </w:r>
       <w:r>
         <w:rPr>
@@ -2123,7 +2191,7 @@
           <w:sz w:val="17"/>
           <w:szCs w:val="17"/>
         </w:rPr>
-        <w:t xml:space="preserve">3.</w:t>
+        <w:t xml:space="preserve">10.</w:t>
       </w:r>
       <w:r>
         <w:rPr>
@@ -2147,7 +2215,7 @@
           <w:sz w:val="17"/>
           <w:szCs w:val="17"/>
         </w:rPr>
-        <w:t xml:space="preserve">4.</w:t>
+        <w:t xml:space="preserve">11.</w:t>
       </w:r>
       <w:r>
         <w:rPr>
@@ -2171,7 +2239,7 @@
           <w:sz w:val="17"/>
           <w:szCs w:val="17"/>
         </w:rPr>
-        <w:t xml:space="preserve">5.</w:t>
+        <w:t xml:space="preserve">12.</w:t>
       </w:r>
       <w:r>
         <w:rPr>
@@ -2195,7 +2263,7 @@
           <w:sz w:val="17"/>
           <w:szCs w:val="17"/>
         </w:rPr>
-        <w:t xml:space="preserve">6.</w:t>
+        <w:t xml:space="preserve">13.</w:t>
       </w:r>
       <w:r>
         <w:rPr>
@@ -2219,7 +2287,7 @@
           <w:sz w:val="17"/>
           <w:szCs w:val="17"/>
         </w:rPr>
-        <w:t xml:space="preserve">7.</w:t>
+        <w:t xml:space="preserve">14.</w:t>
       </w:r>
       <w:r>
         <w:rPr>
@@ -2243,7 +2311,7 @@
           <w:sz w:val="17"/>
           <w:szCs w:val="17"/>
         </w:rPr>
-        <w:t xml:space="preserve">8.</w:t>
+        <w:t xml:space="preserve">15.</w:t>
       </w:r>
       <w:r>
         <w:rPr>
@@ -2267,7 +2335,7 @@
           <w:sz w:val="17"/>
           <w:szCs w:val="17"/>
         </w:rPr>
-        <w:t xml:space="preserve">9.</w:t>
+        <w:t xml:space="preserve">16.</w:t>
       </w:r>
       <w:r>
         <w:rPr>
@@ -2291,7 +2359,7 @@
           <w:sz w:val="17"/>
           <w:szCs w:val="17"/>
         </w:rPr>
-        <w:t xml:space="preserve">10.</w:t>
+        <w:t xml:space="preserve">17.</w:t>
       </w:r>
       <w:r>
         <w:rPr>
@@ -2315,7 +2383,7 @@
           <w:sz w:val="17"/>
           <w:szCs w:val="17"/>
         </w:rPr>
-        <w:t xml:space="preserve">11.</w:t>
+        <w:t xml:space="preserve">18.</w:t>
       </w:r>
       <w:r>
         <w:rPr>
@@ -2339,7 +2407,7 @@
           <w:sz w:val="17"/>
           <w:szCs w:val="17"/>
         </w:rPr>
-        <w:t xml:space="preserve">12.</w:t>
+        <w:t xml:space="preserve">19.</w:t>
       </w:r>
       <w:r>
         <w:rPr>
@@ -2348,6 +2416,193 @@
           <w:szCs w:val="17"/>
         </w:rPr>
         <w:t xml:space="preserve">  Dry the sample in the oven and weigh it dry to correct the dose to g/t.</w:t>
+      </w:r>
+    </w:p>
+    <w:p>
+      <w:pPr>
+        <w:spacing w:after="90" w:before="180" w:line="245"/>
+        <w:keepNext/>
+      </w:pPr>
+      <w:r>
+        <w:rPr>
+          <w:rFonts w:ascii="Calibri" w:cs="Calibri" w:eastAsia="Calibri" w:hAnsi="Calibri"/>
+          <w:b/>
+          <w:bCs/>
+          <w:color w:val="1F3864"/>
+          <w:sz w:val="19"/>
+          <w:szCs w:val="19"/>
+        </w:rPr>
+        <w:t xml:space="preserve">Part C - Effective treatment dosage (ETD) test on tailings [M]</w:t>
+      </w:r>
+    </w:p>
+    <w:p>
+      <w:pPr>
+        <w:spacing w:after="60" w:before="0" w:line="245"/>
+      </w:pPr>
+      <w:r>
+        <w:rPr>
+          <w:rFonts w:ascii="Calibri" w:cs="Calibri" w:eastAsia="Calibri" w:hAnsi="Calibri"/>
+          <w:sz w:val="17"/>
+          <w:szCs w:val="17"/>
+        </w:rPr>
+        <w:t xml:space="preserve">[M] = taken from the Martabe team work instruction "Effective Treatment Dosage (DOC-3-MET-PMC-WIN-00122-IE)" (25/12/2024). [CONFIRM] = unspecified or inconsistent in the source; resolve before this instruction is approved for use. Parts A and B are unchanged.</w:t>
+      </w:r>
+    </w:p>
+    <w:p>
+      <w:pPr>
+        <w:spacing w:after="60" w:before="0" w:line="245"/>
+      </w:pPr>
+      <w:r>
+        <w:rPr>
+          <w:rFonts w:ascii="Calibri" w:cs="Calibri" w:eastAsia="Calibri" w:hAnsi="Calibri"/>
+          <w:sz w:val="17"/>
+          <w:szCs w:val="17"/>
+        </w:rPr>
+        <w:t xml:space="preserve">Purpose [M]: set up the 12 slurry samples for the ETD flocculant test and read the turbidity of the water from the sieve filtering. [CONFIRM] the flocculant test itself is in the Martabe 'WI Flocculant testwork on tailing using sieve', which has not been received; the 276 g basis and the use of 12 samples are not explained.</w:t>
+      </w:r>
+    </w:p>
+    <w:p>
+      <w:pPr>
+        <w:ind w:left="280"/>
+        <w:spacing w:after="50" w:before="0" w:line="245"/>
+      </w:pPr>
+      <w:r>
+        <w:rPr>
+          <w:rFonts w:ascii="Calibri" w:cs="Calibri" w:eastAsia="Calibri" w:hAnsi="Calibri"/>
+          <w:b/>
+          <w:bCs/>
+          <w:sz w:val="17"/>
+          <w:szCs w:val="17"/>
+        </w:rPr>
+        <w:t xml:space="preserve">20.</w:t>
+      </w:r>
+      <w:r>
+        <w:rPr>
+          <w:rFonts w:ascii="Calibri" w:cs="Calibri" w:eastAsia="Calibri" w:hAnsi="Calibri"/>
+          <w:sz w:val="17"/>
+          <w:szCs w:val="17"/>
+        </w:rPr>
+        <w:t xml:space="preserve">  Prepare the beakers, measuring cylinders, level gauge, sieve, turbidity meter, syringe, bucket, cone and cuvettes. Check they are in good condition [M]. Have the flocculant and the slurry sample ready.</w:t>
+      </w:r>
+    </w:p>
+    <w:p>
+      <w:pPr>
+        <w:ind w:left="280"/>
+        <w:spacing w:after="50" w:before="0" w:line="245"/>
+      </w:pPr>
+      <w:r>
+        <w:rPr>
+          <w:rFonts w:ascii="Calibri" w:cs="Calibri" w:eastAsia="Calibri" w:hAnsi="Calibri"/>
+          <w:b/>
+          <w:bCs/>
+          <w:sz w:val="17"/>
+          <w:szCs w:val="17"/>
+        </w:rPr>
+        <w:t xml:space="preserve">21.</w:t>
+      </w:r>
+      <w:r>
+        <w:rPr>
+          <w:rFonts w:ascii="Calibri" w:cs="Calibri" w:eastAsia="Calibri" w:hAnsi="Calibri"/>
+          <w:sz w:val="17"/>
+          <w:szCs w:val="17"/>
+        </w:rPr>
+        <w:t xml:space="preserve">  Stir the slurry in the bucket with the iron stirrer so no solids settle.</w:t>
+      </w:r>
+    </w:p>
+    <w:p>
+      <w:pPr>
+        <w:ind w:left="280"/>
+        <w:spacing w:after="50" w:before="0" w:line="245"/>
+      </w:pPr>
+      <w:r>
+        <w:rPr>
+          <w:rFonts w:ascii="Calibri" w:cs="Calibri" w:eastAsia="Calibri" w:hAnsi="Calibri"/>
+          <w:b/>
+          <w:bCs/>
+          <w:sz w:val="17"/>
+          <w:szCs w:val="17"/>
+        </w:rPr>
+        <w:t xml:space="preserve">22.</w:t>
+      </w:r>
+      <w:r>
+        <w:rPr>
+          <w:rFonts w:ascii="Calibri" w:cs="Calibri" w:eastAsia="Calibri" w:hAnsi="Calibri"/>
+          <w:sz w:val="17"/>
+          <w:szCs w:val="17"/>
+        </w:rPr>
+        <w:t xml:space="preserve">  While stirring, take slurry and weigh 276 g into a beaker. Repeat 12 times to get 12 samples.</w:t>
+      </w:r>
+    </w:p>
+    <w:p>
+      <w:pPr>
+        <w:ind w:left="280"/>
+        <w:spacing w:after="50" w:before="0" w:line="245"/>
+      </w:pPr>
+      <w:r>
+        <w:rPr>
+          <w:rFonts w:ascii="Calibri" w:cs="Calibri" w:eastAsia="Calibri" w:hAnsi="Calibri"/>
+          <w:b/>
+          <w:bCs/>
+          <w:sz w:val="17"/>
+          <w:szCs w:val="17"/>
+        </w:rPr>
+        <w:t xml:space="preserve">23.</w:t>
+      </w:r>
+      <w:r>
+        <w:rPr>
+          <w:rFonts w:ascii="Calibri" w:cs="Calibri" w:eastAsia="Calibri" w:hAnsi="Calibri"/>
+          <w:sz w:val="17"/>
+          <w:szCs w:val="17"/>
+        </w:rPr>
+        <w:t xml:space="preserve">  Carry out the flocculant test as the Martabe sieve flocculant instruction describes (not received).</w:t>
+      </w:r>
+    </w:p>
+    <w:p>
+      <w:pPr>
+        <w:ind w:left="280"/>
+        <w:spacing w:after="50" w:before="0" w:line="245"/>
+      </w:pPr>
+      <w:r>
+        <w:rPr>
+          <w:rFonts w:ascii="Calibri" w:cs="Calibri" w:eastAsia="Calibri" w:hAnsi="Calibri"/>
+          <w:b/>
+          <w:bCs/>
+          <w:sz w:val="17"/>
+          <w:szCs w:val="17"/>
+        </w:rPr>
+        <w:t xml:space="preserve">24.</w:t>
+      </w:r>
+      <w:r>
+        <w:rPr>
+          <w:rFonts w:ascii="Calibri" w:cs="Calibri" w:eastAsia="Calibri" w:hAnsi="Calibri"/>
+          <w:sz w:val="17"/>
+          <w:szCs w:val="17"/>
+        </w:rPr>
+        <w:t xml:space="preserve">  Check the turbidity of the water that came through the sieve: power on the turbidity meter, put the cuvette in the sample holder, press read, wait for the result and record it. Take the cuvette out.</w:t>
+      </w:r>
+    </w:p>
+    <w:p>
+      <w:pPr>
+        <w:ind w:left="280"/>
+        <w:spacing w:after="50" w:before="0" w:line="245"/>
+      </w:pPr>
+      <w:r>
+        <w:rPr>
+          <w:rFonts w:ascii="Calibri" w:cs="Calibri" w:eastAsia="Calibri" w:hAnsi="Calibri"/>
+          <w:b/>
+          <w:bCs/>
+          <w:sz w:val="17"/>
+          <w:szCs w:val="17"/>
+        </w:rPr>
+        <w:t xml:space="preserve">25.</w:t>
+      </w:r>
+      <w:r>
+        <w:rPr>
+          <w:rFonts w:ascii="Calibri" w:cs="Calibri" w:eastAsia="Calibri" w:hAnsi="Calibri"/>
+          <w:sz w:val="17"/>
+          <w:szCs w:val="17"/>
+        </w:rPr>
+        <w:t xml:space="preserve">  Record the ETD data in 'G:\Processing\5. Metallurgy\Metallurgy Lab\04 Metlab Data\ETD &amp; Settling Test' or on form DOC-4-MET-PMC-DFR-00140-EN (Form ETD Data.xlsx).</w:t>
       </w:r>
     </w:p>
     <w:p>
@@ -2579,6 +2834,24 @@
           <w:szCs w:val="17"/>
         </w:rPr>
         <w:t xml:space="preserve">Martabe work instruction 'Settling Test with Variance %Strength Flocc' (Indonesian, 22/03/2025) - Part B source</w:t>
+      </w:r>
+    </w:p>
+    <w:p>
+      <w:pPr>
+        <w:pStyle w:val="ListParagraph"/>
+        <w:numPr>
+          <w:ilvl w:val="0"/>
+          <w:numId w:val="1"/>
+        </w:numPr>
+        <w:spacing w:after="60" w:line="245"/>
+      </w:pPr>
+      <w:r>
+        <w:rPr>
+          <w:rFonts w:ascii="Calibri" w:cs="Calibri" w:eastAsia="Calibri" w:hAnsi="Calibri"/>
+          <w:sz w:val="17"/>
+          <w:szCs w:val="17"/>
+        </w:rPr>
+        <w:t xml:space="preserve">Martabe work instruction 'Effective Treatment Dosage' DOC-3-MET-PMC-WIN-00122-IE v1.0 (issued 25/12/2024; reference SOP DOC-IV-MET-CHH-SOP-00039) - Part C source</w:t>
       </w:r>
     </w:p>
     <w:sectPr>

</xml_diff>